<commit_message>
debug info update, a bit more numerical stability
</commit_message>
<xml_diff>
--- a/DebuggingMaterials/InfoForDebugging.docx
+++ b/DebuggingMaterials/InfoForDebugging.docx
@@ -1354,6 +1354,333 @@
           <w:rFonts w:ascii="Roboto" w:hAnsi="Roboto"/>
         </w:rPr>
         <w:t>Feel free to ask a ton of questions if anything is unclear, I tried a lot of things that I haven’t mentioned here. It’s faster and more convenient to just ask me, I spent the past month looking every single day at this code. Thanks in advance.</w:t>
+      </w:r>
+    </w:p>
+    <w:p>
+      <w:pPr>
+        <w:pStyle w:val="ListParagraph"/>
+        <w:rPr>
+          <w:rFonts w:ascii="Roboto" w:hAnsi="Roboto"/>
+        </w:rPr>
+      </w:pPr>
+    </w:p>
+    <w:p>
+      <w:pPr>
+        <w:pStyle w:val="ListParagraph"/>
+        <w:rPr>
+          <w:rFonts w:ascii="Roboto" w:hAnsi="Roboto"/>
+        </w:rPr>
+      </w:pPr>
+    </w:p>
+    <w:p>
+      <w:pPr>
+        <w:pStyle w:val="ListParagraph"/>
+        <w:rPr>
+          <w:rFonts w:ascii="Roboto" w:hAnsi="Roboto"/>
+          <w:sz w:val="24"/>
+          <w:szCs w:val="24"/>
+        </w:rPr>
+      </w:pPr>
+      <w:r>
+        <w:rPr>
+          <w:rFonts w:ascii="Roboto" w:hAnsi="Roboto"/>
+          <w:sz w:val="24"/>
+          <w:szCs w:val="24"/>
+        </w:rPr>
+        <w:lastRenderedPageBreak/>
+        <w:t>Update 20.05.2024:</w:t>
+      </w:r>
+    </w:p>
+    <w:p>
+      <w:pPr>
+        <w:pStyle w:val="ListParagraph"/>
+        <w:rPr>
+          <w:rFonts w:ascii="Roboto" w:hAnsi="Roboto"/>
+        </w:rPr>
+      </w:pPr>
+    </w:p>
+    <w:p>
+      <w:pPr>
+        <w:pStyle w:val="ListParagraph"/>
+        <w:rPr>
+          <w:rFonts w:ascii="Roboto" w:hAnsi="Roboto"/>
+        </w:rPr>
+      </w:pPr>
+      <w:r>
+        <w:rPr>
+          <w:rFonts w:ascii="Roboto" w:hAnsi="Roboto"/>
+        </w:rPr>
+        <w:t xml:space="preserve">On a </w:t>
+      </w:r>
+      <w:r>
+        <w:rPr>
+          <w:rFonts w:ascii="Roboto" w:hAnsi="Roboto"/>
+        </w:rPr>
+        <w:t xml:space="preserve">separate branch </w:t>
+      </w:r>
+      <w:r>
+        <w:rPr>
+          <w:rFonts w:ascii="Roboto" w:hAnsi="Roboto"/>
+          <w:i/>
+          <w:iCs/>
+        </w:rPr>
+        <w:t>randomDebugging</w:t>
+      </w:r>
+      <w:r>
+        <w:rPr>
+          <w:rFonts w:ascii="Roboto" w:hAnsi="Roboto"/>
+        </w:rPr>
+        <w:t xml:space="preserve"> I substituted my code with known good reference, that strips down all of the universality and adaptibility of the code. So, I manually took the reference, put in the correct layer sizes (for PushBlock code only) and changed a few variable names to keep everything work together and: everything still doesn’t work.</w:t>
+      </w:r>
+    </w:p>
+    <w:p>
+      <w:pPr>
+        <w:pStyle w:val="ListParagraph"/>
+        <w:rPr>
+          <w:rFonts w:ascii="Roboto" w:hAnsi="Roboto"/>
+        </w:rPr>
+      </w:pPr>
+    </w:p>
+    <w:p>
+      <w:pPr>
+        <w:pStyle w:val="ListParagraph"/>
+        <w:rPr>
+          <w:rFonts w:ascii="Roboto" w:hAnsi="Roboto"/>
+        </w:rPr>
+      </w:pPr>
+      <w:r>
+        <w:rPr>
+          <w:rFonts w:ascii="Roboto" w:hAnsi="Roboto"/>
+        </w:rPr>
+        <w:t>That helps, but also confuses even more at the same time. It means that:</w:t>
+      </w:r>
+    </w:p>
+    <w:p>
+      <w:pPr>
+        <w:pStyle w:val="ListParagraph"/>
+        <w:rPr>
+          <w:rFonts w:ascii="Roboto" w:hAnsi="Roboto"/>
+        </w:rPr>
+      </w:pPr>
+    </w:p>
+    <w:p>
+      <w:pPr>
+        <w:pStyle w:val="ListParagraph"/>
+        <w:numPr>
+          <w:ilvl w:val="0"/>
+          <w:numId w:val="1"/>
+        </w:numPr>
+        <w:rPr>
+          <w:rFonts w:ascii="Roboto" w:hAnsi="Roboto"/>
+        </w:rPr>
+      </w:pPr>
+      <w:r>
+        <w:rPr>
+          <w:rFonts w:ascii="Roboto" w:hAnsi="Roboto"/>
+        </w:rPr>
+        <w:t xml:space="preserve">Multidiscrete novel approach is </w:t>
+      </w:r>
+      <w:r>
+        <w:rPr>
+          <w:rFonts w:ascii="Roboto" w:hAnsi="Roboto"/>
+        </w:rPr>
+        <w:tab/>
+      </w:r>
+      <w:r>
+        <w:rPr>
+          <w:rFonts w:ascii="Roboto" w:hAnsi="Roboto"/>
+        </w:rPr>
+        <w:tab/>
+        <w:t>not the problem</w:t>
+      </w:r>
+    </w:p>
+    <w:p>
+      <w:pPr>
+        <w:pStyle w:val="ListParagraph"/>
+        <w:numPr>
+          <w:ilvl w:val="0"/>
+          <w:numId w:val="1"/>
+        </w:numPr>
+        <w:rPr>
+          <w:rFonts w:ascii="Roboto" w:hAnsi="Roboto"/>
+        </w:rPr>
+      </w:pPr>
+      <w:r>
+        <w:rPr>
+          <w:rFonts w:ascii="Roboto" w:hAnsi="Roboto"/>
+        </w:rPr>
+        <w:t xml:space="preserve">The whole Actor is </w:t>
+      </w:r>
+      <w:r>
+        <w:rPr>
+          <w:rFonts w:ascii="Roboto" w:hAnsi="Roboto"/>
+        </w:rPr>
+        <w:tab/>
+      </w:r>
+      <w:r>
+        <w:rPr>
+          <w:rFonts w:ascii="Roboto" w:hAnsi="Roboto"/>
+        </w:rPr>
+        <w:tab/>
+      </w:r>
+      <w:r>
+        <w:rPr>
+          <w:rFonts w:ascii="Roboto" w:hAnsi="Roboto"/>
+        </w:rPr>
+        <w:tab/>
+      </w:r>
+      <w:r>
+        <w:rPr>
+          <w:rFonts w:ascii="Roboto" w:hAnsi="Roboto"/>
+        </w:rPr>
+        <w:tab/>
+        <w:t>not the problem</w:t>
+      </w:r>
+    </w:p>
+    <w:p>
+      <w:pPr>
+        <w:pStyle w:val="ListParagraph"/>
+        <w:numPr>
+          <w:ilvl w:val="0"/>
+          <w:numId w:val="1"/>
+        </w:numPr>
+        <w:rPr>
+          <w:rFonts w:ascii="Roboto" w:hAnsi="Roboto"/>
+        </w:rPr>
+      </w:pPr>
+      <w:r>
+        <w:rPr>
+          <w:rFonts w:ascii="Roboto" w:hAnsi="Roboto"/>
+        </w:rPr>
+        <w:t xml:space="preserve">Critic is also </w:t>
+      </w:r>
+      <w:r>
+        <w:rPr>
+          <w:rFonts w:ascii="Roboto" w:hAnsi="Roboto"/>
+        </w:rPr>
+        <w:tab/>
+      </w:r>
+      <w:r>
+        <w:rPr>
+          <w:rFonts w:ascii="Roboto" w:hAnsi="Roboto"/>
+        </w:rPr>
+        <w:tab/>
+      </w:r>
+      <w:r>
+        <w:rPr>
+          <w:rFonts w:ascii="Roboto" w:hAnsi="Roboto"/>
+        </w:rPr>
+        <w:tab/>
+      </w:r>
+      <w:r>
+        <w:rPr>
+          <w:rFonts w:ascii="Roboto" w:hAnsi="Roboto"/>
+        </w:rPr>
+        <w:tab/>
+      </w:r>
+      <w:r>
+        <w:rPr>
+          <w:rFonts w:ascii="Roboto" w:hAnsi="Roboto"/>
+        </w:rPr>
+        <w:tab/>
+        <w:t>not the problem</w:t>
+      </w:r>
+    </w:p>
+    <w:p>
+      <w:pPr>
+        <w:pStyle w:val="ListParagraph"/>
+        <w:numPr>
+          <w:ilvl w:val="0"/>
+          <w:numId w:val="1"/>
+        </w:numPr>
+        <w:rPr>
+          <w:rFonts w:ascii="Roboto" w:hAnsi="Roboto"/>
+        </w:rPr>
+      </w:pPr>
+      <w:r>
+        <w:rPr>
+          <w:rFonts w:ascii="Roboto" w:hAnsi="Roboto"/>
+        </w:rPr>
+        <w:t>Optimization of actor, critic and alpha is</w:t>
+      </w:r>
+      <w:r>
+        <w:rPr>
+          <w:rFonts w:ascii="Roboto" w:hAnsi="Roboto"/>
+        </w:rPr>
+        <w:tab/>
+        <w:t>not the problem</w:t>
+      </w:r>
+    </w:p>
+    <w:p>
+      <w:pPr>
+        <w:pStyle w:val="ListParagraph"/>
+        <w:rPr>
+          <w:rFonts w:ascii="Roboto" w:hAnsi="Roboto"/>
+        </w:rPr>
+      </w:pPr>
+    </w:p>
+    <w:p>
+      <w:pPr>
+        <w:pStyle w:val="ListParagraph"/>
+        <w:rPr>
+          <w:rFonts w:ascii="Roboto" w:hAnsi="Roboto"/>
+        </w:rPr>
+      </w:pPr>
+    </w:p>
+    <w:p>
+      <w:pPr>
+        <w:pStyle w:val="ListParagraph"/>
+        <w:rPr>
+          <w:rFonts w:ascii="Roboto" w:hAnsi="Roboto"/>
+        </w:rPr>
+      </w:pPr>
+    </w:p>
+    <w:p>
+      <w:pPr>
+        <w:pStyle w:val="ListParagraph"/>
+        <w:rPr>
+          <w:rFonts w:ascii="Roboto" w:hAnsi="Roboto"/>
+        </w:rPr>
+      </w:pPr>
+      <w:r>
+        <w:rPr>
+          <w:rFonts w:ascii="Roboto" w:hAnsi="Roboto"/>
+        </w:rPr>
+        <w:t>What is the problem then?! We know that continuous action branch works, so it makes sense to only investigate the parts of the code that are separate from it. But I’m a bit lost at this point. And by “a bit lost” I mean completely lost</w:t>
+      </w:r>
+      <w:r>
+        <w:rPr>
+          <w:rFonts w:ascii="Roboto" w:hAnsi="Roboto"/>
+        </w:rPr>
+        <w:t xml:space="preserve"> and out of ideas.</w:t>
+      </w:r>
+    </w:p>
+    <w:p>
+      <w:pPr>
+        <w:pStyle w:val="ListParagraph"/>
+        <w:rPr>
+          <w:rFonts w:ascii="Roboto" w:hAnsi="Roboto"/>
+        </w:rPr>
+      </w:pPr>
+    </w:p>
+    <w:p>
+      <w:pPr>
+        <w:pStyle w:val="ListParagraph"/>
+        <w:rPr>
+          <w:rFonts w:ascii="Roboto" w:hAnsi="Roboto"/>
+        </w:rPr>
+      </w:pPr>
+      <w:r>
+        <w:rPr>
+          <w:rFonts w:ascii="Roboto" w:hAnsi="Roboto"/>
+        </w:rPr>
+        <w:t>The only brute force way forward is starting with a good reference with one discrete action and line by line converting it to my version until something breaks. It’s gonna take a long time, though</w:t>
+      </w:r>
+      <w:r>
+        <w:rPr>
+          <w:rFonts w:ascii="Roboto" w:hAnsi="Roboto"/>
+        </w:rPr>
+        <w:t>.</w:t>
       </w:r>
     </w:p>
     <w:sectPr>

</xml_diff>